<commit_message>
Update document metadata to include generated cell inspection form
Add metadata for the generated DC6-221 Cell Inspection sample document to the agent assets.

Replit-Commit-Author: Agent
Replit-Commit-Session-Id: 12181e52-eb76-427f-8200-e868f0fd7a8f
Replit-Commit-Checkpoint-Type: full_checkpoint
Replit-Commit-Event-Id: 1eb52f91-74aa-46ea-bb32-a5112fde6b50
Replit-Commit-Screenshot-Url: https://storage.googleapis.com/screenshot-production-us-central1/d76cc230-a508-46af-99a2-c8a4a09ee388/12181e52-eb76-427f-8200-e868f0fd7a8f/hkiTPMe
Replit-Helium-Checkpoint-Created: true
</commit_message>
<xml_diff>
--- a/exports/DC6-221 Cell Inspection - Sample.docx
+++ b/exports/DC6-221 Cell Inspection - Sample.docx
@@ -828,10 +828,9 @@
             </w:r>
             <w:r>
               <w:rPr>
-                <w:b/>
-                <w:sz w:val="14"/>
-                <w:szCs w:val="14"/>
-                <w:u w:val="single"/>
+                <w:sz w:val="14"/>
+                <w:szCs w:val="14"/>
+                <w:strike/>
               </w:rPr>
               <w:t xml:space="preserve">SAT</w:t>
             </w:r>
@@ -856,9 +855,8 @@
             </w:pPr>
             <w:r>
               <w:rPr>
-                <w:b/>
-                <w:sz w:val="20"/>
-                <w:u w:val="single"/>
+                <w:sz w:val="20"/>
+                <w:strike/>
               </w:rPr>
               <w:t xml:space="preserve">N/A</w:t>
             </w:r>
@@ -1021,10 +1019,9 @@
             </w:r>
             <w:r>
               <w:rPr>
-                <w:b/>
-                <w:sz w:val="14"/>
-                <w:szCs w:val="14"/>
-                <w:u w:val="single"/>
+                <w:sz w:val="14"/>
+                <w:szCs w:val="14"/>
+                <w:strike/>
               </w:rPr>
               <w:t xml:space="preserve">SAT</w:t>
             </w:r>
@@ -1044,9 +1041,8 @@
           <w:p>
             <w:r>
               <w:rPr>
-                <w:b/>
-                <w:sz w:val="20"/>
-                <w:u w:val="single"/>
+                <w:sz w:val="20"/>
+                <w:strike/>
               </w:rPr>
               <w:t xml:space="preserve">N/A</w:t>
             </w:r>
@@ -1209,10 +1205,9 @@
             </w:r>
             <w:r>
               <w:rPr>
-                <w:b/>
-                <w:sz w:val="14"/>
-                <w:szCs w:val="14"/>
-                <w:u w:val="single"/>
+                <w:sz w:val="14"/>
+                <w:szCs w:val="14"/>
+                <w:strike/>
               </w:rPr>
               <w:t xml:space="preserve">SAT</w:t>
             </w:r>
@@ -1232,9 +1227,8 @@
           <w:p>
             <w:r>
               <w:rPr>
-                <w:b/>
-                <w:sz w:val="20"/>
-                <w:u w:val="single"/>
+                <w:sz w:val="20"/>
+                <w:strike/>
               </w:rPr>
               <w:t xml:space="preserve">N/A</w:t>
             </w:r>
@@ -1397,10 +1391,9 @@
             </w:r>
             <w:r>
               <w:rPr>
-                <w:b/>
-                <w:sz w:val="14"/>
-                <w:szCs w:val="14"/>
-                <w:u w:val="single"/>
+                <w:sz w:val="14"/>
+                <w:szCs w:val="14"/>
+                <w:strike/>
               </w:rPr>
               <w:t xml:space="preserve">SAT</w:t>
             </w:r>
@@ -1420,9 +1413,8 @@
           <w:p>
             <w:r>
               <w:rPr>
-                <w:b/>
-                <w:sz w:val="20"/>
-                <w:u w:val="single"/>
+                <w:sz w:val="20"/>
+                <w:strike/>
               </w:rPr>
               <w:t xml:space="preserve">N/A</w:t>
             </w:r>
@@ -1585,10 +1577,9 @@
             </w:r>
             <w:r>
               <w:rPr>
-                <w:b/>
-                <w:sz w:val="14"/>
-                <w:szCs w:val="14"/>
-                <w:u w:val="single"/>
+                <w:sz w:val="14"/>
+                <w:szCs w:val="14"/>
+                <w:strike/>
               </w:rPr>
               <w:t xml:space="preserve">SAT</w:t>
             </w:r>
@@ -1608,9 +1599,8 @@
           <w:p>
             <w:r>
               <w:rPr>
-                <w:b/>
-                <w:sz w:val="20"/>
-                <w:u w:val="single"/>
+                <w:sz w:val="20"/>
+                <w:strike/>
               </w:rPr>
               <w:t xml:space="preserve">N/A</w:t>
             </w:r>
@@ -1773,10 +1763,9 @@
             </w:r>
             <w:r>
               <w:rPr>
-                <w:b/>
-                <w:sz w:val="14"/>
-                <w:szCs w:val="14"/>
-                <w:u w:val="single"/>
+                <w:sz w:val="14"/>
+                <w:szCs w:val="14"/>
+                <w:strike/>
               </w:rPr>
               <w:t xml:space="preserve">SAT</w:t>
             </w:r>
@@ -1796,9 +1785,8 @@
           <w:p>
             <w:r>
               <w:rPr>
-                <w:b/>
-                <w:sz w:val="20"/>
-                <w:u w:val="single"/>
+                <w:sz w:val="20"/>
+                <w:strike/>
               </w:rPr>
               <w:t xml:space="preserve">N/A</w:t>
             </w:r>
@@ -1961,10 +1949,9 @@
             </w:r>
             <w:r>
               <w:rPr>
-                <w:b/>
-                <w:sz w:val="14"/>
-                <w:szCs w:val="14"/>
-                <w:u w:val="single"/>
+                <w:sz w:val="14"/>
+                <w:szCs w:val="14"/>
+                <w:strike/>
               </w:rPr>
               <w:t xml:space="preserve">SAT</w:t>
             </w:r>
@@ -1984,9 +1971,8 @@
           <w:p>
             <w:r>
               <w:rPr>
-                <w:b/>
-                <w:sz w:val="20"/>
-                <w:u w:val="single"/>
+                <w:sz w:val="20"/>
+                <w:strike/>
               </w:rPr>
               <w:t xml:space="preserve">N/A</w:t>
             </w:r>
@@ -2149,10 +2135,9 @@
             </w:r>
             <w:r>
               <w:rPr>
-                <w:b/>
-                <w:sz w:val="14"/>
-                <w:szCs w:val="14"/>
-                <w:u w:val="single"/>
+                <w:sz w:val="14"/>
+                <w:szCs w:val="14"/>
+                <w:strike/>
               </w:rPr>
               <w:t xml:space="preserve">SAT</w:t>
             </w:r>
@@ -2172,9 +2157,8 @@
           <w:p>
             <w:r>
               <w:rPr>
-                <w:b/>
-                <w:sz w:val="20"/>
-                <w:u w:val="single"/>
+                <w:sz w:val="20"/>
+                <w:strike/>
               </w:rPr>
               <w:t xml:space="preserve">N/A</w:t>
             </w:r>
@@ -2337,10 +2321,9 @@
             </w:r>
             <w:r>
               <w:rPr>
-                <w:b/>
-                <w:sz w:val="14"/>
-                <w:szCs w:val="14"/>
-                <w:u w:val="single"/>
+                <w:sz w:val="14"/>
+                <w:szCs w:val="14"/>
+                <w:strike/>
               </w:rPr>
               <w:t xml:space="preserve">SAT</w:t>
             </w:r>
@@ -2360,9 +2343,8 @@
           <w:p>
             <w:r>
               <w:rPr>
-                <w:b/>
-                <w:sz w:val="20"/>
-                <w:u w:val="single"/>
+                <w:sz w:val="20"/>
+                <w:strike/>
               </w:rPr>
               <w:t xml:space="preserve">N/A</w:t>
             </w:r>
@@ -2525,10 +2507,9 @@
             </w:r>
             <w:r>
               <w:rPr>
-                <w:b/>
-                <w:sz w:val="14"/>
-                <w:szCs w:val="14"/>
-                <w:u w:val="single"/>
+                <w:sz w:val="14"/>
+                <w:szCs w:val="14"/>
+                <w:strike/>
               </w:rPr>
               <w:t xml:space="preserve">SAT</w:t>
             </w:r>
@@ -2548,9 +2529,8 @@
           <w:p>
             <w:r>
               <w:rPr>
-                <w:b/>
-                <w:sz w:val="20"/>
-                <w:u w:val="single"/>
+                <w:sz w:val="20"/>
+                <w:strike/>
               </w:rPr>
               <w:t xml:space="preserve">N/A</w:t>
             </w:r>
@@ -2723,10 +2703,9 @@
             </w:r>
             <w:r>
               <w:rPr>
-                <w:b/>
-                <w:sz w:val="14"/>
-                <w:szCs w:val="14"/>
-                <w:u w:val="single"/>
+                <w:sz w:val="14"/>
+                <w:szCs w:val="14"/>
+                <w:strike/>
               </w:rPr>
               <w:t xml:space="preserve">SAT</w:t>
             </w:r>
@@ -2746,9 +2725,8 @@
           <w:p>
             <w:r>
               <w:rPr>
-                <w:b/>
-                <w:sz w:val="20"/>
-                <w:u w:val="single"/>
+                <w:sz w:val="20"/>
+                <w:strike/>
               </w:rPr>
               <w:t xml:space="preserve">N/A</w:t>
             </w:r>
@@ -2911,10 +2889,9 @@
             </w:r>
             <w:r>
               <w:rPr>
-                <w:b/>
-                <w:sz w:val="14"/>
-                <w:szCs w:val="14"/>
-                <w:u w:val="single"/>
+                <w:sz w:val="14"/>
+                <w:szCs w:val="14"/>
+                <w:strike/>
               </w:rPr>
               <w:t xml:space="preserve">SAT</w:t>
             </w:r>
@@ -2934,9 +2911,8 @@
           <w:p>
             <w:r>
               <w:rPr>
-                <w:b/>
-                <w:sz w:val="20"/>
-                <w:u w:val="single"/>
+                <w:sz w:val="20"/>
+                <w:strike/>
               </w:rPr>
               <w:t xml:space="preserve">N/A</w:t>
             </w:r>

</xml_diff>

<commit_message>
Format cell text to fit on a single line and apply strikethrough
Implement `markWordInCellFitOneLine` to shrink font size and ensure text fits on one line within cells, specifically for the DC6-221 form's condition status. Apply strikethrough to "SAT" and "N/A" in the appropriate cells.

Replit-Commit-Author: Agent
Replit-Commit-Session-Id: 12181e52-eb76-427f-8200-e868f0fd7a8f
Replit-Commit-Checkpoint-Type: full_checkpoint
Replit-Commit-Event-Id: 4c840250-7eb3-43a9-bbae-84c27729b8a6
Replit-Commit-Screenshot-Url: https://storage.googleapis.com/screenshot-production-us-central1/d76cc230-a508-46af-99a2-c8a4a09ee388/12181e52-eb76-427f-8200-e868f0fd7a8f/hkiTPMe
Replit-Helium-Checkpoint-Created: true
</commit_message>
<xml_diff>
--- a/exports/DC6-221 Cell Inspection - Sample.docx
+++ b/exports/DC6-221 Cell Inspection - Sample.docx
@@ -821,23 +821,23 @@
             </w:pPr>
             <w:r>
               <w:rPr>
-                <w:sz w:val="14"/>
-                <w:szCs w:val="14"/>
+                <w:sz w:val="12"/>
+                <w:szCs w:val="12"/>
               </w:rPr>
               <w:t xml:space="preserve">GOOD/ </w:t>
             </w:r>
             <w:r>
               <w:rPr>
-                <w:sz w:val="14"/>
-                <w:szCs w:val="14"/>
                 <w:strike/>
+                <w:sz w:val="12"/>
+                <w:szCs w:val="12"/>
               </w:rPr>
               <w:t xml:space="preserve">SAT</w:t>
             </w:r>
             <w:r>
               <w:rPr>
-                <w:sz w:val="14"/>
-                <w:szCs w:val="14"/>
+                <w:sz w:val="12"/>
+                <w:szCs w:val="12"/>
               </w:rPr>
               <w:t xml:space="preserve">/ POOR</w:t>
             </w:r>
@@ -1012,23 +1012,23 @@
           <w:p>
             <w:r>
               <w:rPr>
-                <w:sz w:val="14"/>
-                <w:szCs w:val="14"/>
+                <w:sz w:val="12"/>
+                <w:szCs w:val="12"/>
               </w:rPr>
               <w:t xml:space="preserve">GOOD/ </w:t>
             </w:r>
             <w:r>
               <w:rPr>
-                <w:sz w:val="14"/>
-                <w:szCs w:val="14"/>
                 <w:strike/>
+                <w:sz w:val="12"/>
+                <w:szCs w:val="12"/>
               </w:rPr>
               <w:t xml:space="preserve">SAT</w:t>
             </w:r>
             <w:r>
               <w:rPr>
-                <w:sz w:val="14"/>
-                <w:szCs w:val="14"/>
+                <w:sz w:val="12"/>
+                <w:szCs w:val="12"/>
               </w:rPr>
               <w:t xml:space="preserve">/ POOR</w:t>
             </w:r>
@@ -1198,23 +1198,23 @@
           <w:p>
             <w:r>
               <w:rPr>
-                <w:sz w:val="14"/>
-                <w:szCs w:val="14"/>
+                <w:sz w:val="12"/>
+                <w:szCs w:val="12"/>
               </w:rPr>
               <w:t xml:space="preserve">GOOD/ </w:t>
             </w:r>
             <w:r>
               <w:rPr>
-                <w:sz w:val="14"/>
-                <w:szCs w:val="14"/>
                 <w:strike/>
+                <w:sz w:val="12"/>
+                <w:szCs w:val="12"/>
               </w:rPr>
               <w:t xml:space="preserve">SAT</w:t>
             </w:r>
             <w:r>
               <w:rPr>
-                <w:sz w:val="14"/>
-                <w:szCs w:val="14"/>
+                <w:sz w:val="12"/>
+                <w:szCs w:val="12"/>
               </w:rPr>
               <w:t xml:space="preserve">/ POOR</w:t>
             </w:r>
@@ -1384,23 +1384,23 @@
           <w:p>
             <w:r>
               <w:rPr>
-                <w:sz w:val="14"/>
-                <w:szCs w:val="14"/>
+                <w:sz w:val="12"/>
+                <w:szCs w:val="12"/>
               </w:rPr>
               <w:t xml:space="preserve">GOOD/ </w:t>
             </w:r>
             <w:r>
               <w:rPr>
-                <w:sz w:val="14"/>
-                <w:szCs w:val="14"/>
                 <w:strike/>
+                <w:sz w:val="12"/>
+                <w:szCs w:val="12"/>
               </w:rPr>
               <w:t xml:space="preserve">SAT</w:t>
             </w:r>
             <w:r>
               <w:rPr>
-                <w:sz w:val="14"/>
-                <w:szCs w:val="14"/>
+                <w:sz w:val="12"/>
+                <w:szCs w:val="12"/>
               </w:rPr>
               <w:t xml:space="preserve">/ POOR</w:t>
             </w:r>
@@ -1570,23 +1570,23 @@
           <w:p>
             <w:r>
               <w:rPr>
-                <w:sz w:val="14"/>
-                <w:szCs w:val="14"/>
+                <w:sz w:val="12"/>
+                <w:szCs w:val="12"/>
               </w:rPr>
               <w:t xml:space="preserve">GOOD/ </w:t>
             </w:r>
             <w:r>
               <w:rPr>
-                <w:sz w:val="14"/>
-                <w:szCs w:val="14"/>
                 <w:strike/>
+                <w:sz w:val="12"/>
+                <w:szCs w:val="12"/>
               </w:rPr>
               <w:t xml:space="preserve">SAT</w:t>
             </w:r>
             <w:r>
               <w:rPr>
-                <w:sz w:val="14"/>
-                <w:szCs w:val="14"/>
+                <w:sz w:val="12"/>
+                <w:szCs w:val="12"/>
               </w:rPr>
               <w:t xml:space="preserve">/ POOR</w:t>
             </w:r>
@@ -1756,23 +1756,23 @@
           <w:p>
             <w:r>
               <w:rPr>
-                <w:sz w:val="14"/>
-                <w:szCs w:val="14"/>
+                <w:sz w:val="12"/>
+                <w:szCs w:val="12"/>
               </w:rPr>
               <w:t xml:space="preserve">GOOD/ </w:t>
             </w:r>
             <w:r>
               <w:rPr>
-                <w:sz w:val="14"/>
-                <w:szCs w:val="14"/>
                 <w:strike/>
+                <w:sz w:val="12"/>
+                <w:szCs w:val="12"/>
               </w:rPr>
               <w:t xml:space="preserve">SAT</w:t>
             </w:r>
             <w:r>
               <w:rPr>
-                <w:sz w:val="14"/>
-                <w:szCs w:val="14"/>
+                <w:sz w:val="12"/>
+                <w:szCs w:val="12"/>
               </w:rPr>
               <w:t xml:space="preserve">/ POOR</w:t>
             </w:r>
@@ -1942,23 +1942,23 @@
           <w:p>
             <w:r>
               <w:rPr>
-                <w:sz w:val="14"/>
-                <w:szCs w:val="14"/>
+                <w:sz w:val="12"/>
+                <w:szCs w:val="12"/>
               </w:rPr>
               <w:t xml:space="preserve">GOOD/ </w:t>
             </w:r>
             <w:r>
               <w:rPr>
-                <w:sz w:val="14"/>
-                <w:szCs w:val="14"/>
                 <w:strike/>
+                <w:sz w:val="12"/>
+                <w:szCs w:val="12"/>
               </w:rPr>
               <w:t xml:space="preserve">SAT</w:t>
             </w:r>
             <w:r>
               <w:rPr>
-                <w:sz w:val="14"/>
-                <w:szCs w:val="14"/>
+                <w:sz w:val="12"/>
+                <w:szCs w:val="12"/>
               </w:rPr>
               <w:t xml:space="preserve">/ POOR</w:t>
             </w:r>
@@ -2128,23 +2128,23 @@
           <w:p>
             <w:r>
               <w:rPr>
-                <w:sz w:val="14"/>
-                <w:szCs w:val="14"/>
+                <w:sz w:val="12"/>
+                <w:szCs w:val="12"/>
               </w:rPr>
               <w:t xml:space="preserve">GOOD/ </w:t>
             </w:r>
             <w:r>
               <w:rPr>
-                <w:sz w:val="14"/>
-                <w:szCs w:val="14"/>
                 <w:strike/>
+                <w:sz w:val="12"/>
+                <w:szCs w:val="12"/>
               </w:rPr>
               <w:t xml:space="preserve">SAT</w:t>
             </w:r>
             <w:r>
               <w:rPr>
-                <w:sz w:val="14"/>
-                <w:szCs w:val="14"/>
+                <w:sz w:val="12"/>
+                <w:szCs w:val="12"/>
               </w:rPr>
               <w:t xml:space="preserve">/ POOR</w:t>
             </w:r>
@@ -2314,23 +2314,23 @@
           <w:p>
             <w:r>
               <w:rPr>
-                <w:sz w:val="14"/>
-                <w:szCs w:val="14"/>
+                <w:sz w:val="12"/>
+                <w:szCs w:val="12"/>
               </w:rPr>
               <w:t xml:space="preserve">GOOD/ </w:t>
             </w:r>
             <w:r>
               <w:rPr>
-                <w:sz w:val="14"/>
-                <w:szCs w:val="14"/>
                 <w:strike/>
+                <w:sz w:val="12"/>
+                <w:szCs w:val="12"/>
               </w:rPr>
               <w:t xml:space="preserve">SAT</w:t>
             </w:r>
             <w:r>
               <w:rPr>
-                <w:sz w:val="14"/>
-                <w:szCs w:val="14"/>
+                <w:sz w:val="12"/>
+                <w:szCs w:val="12"/>
               </w:rPr>
               <w:t xml:space="preserve">/ POOR</w:t>
             </w:r>
@@ -2500,23 +2500,23 @@
           <w:p>
             <w:r>
               <w:rPr>
-                <w:sz w:val="14"/>
-                <w:szCs w:val="14"/>
+                <w:sz w:val="12"/>
+                <w:szCs w:val="12"/>
               </w:rPr>
               <w:t xml:space="preserve">GOOD/ </w:t>
             </w:r>
             <w:r>
               <w:rPr>
-                <w:sz w:val="14"/>
-                <w:szCs w:val="14"/>
                 <w:strike/>
+                <w:sz w:val="12"/>
+                <w:szCs w:val="12"/>
               </w:rPr>
               <w:t xml:space="preserve">SAT</w:t>
             </w:r>
             <w:r>
               <w:rPr>
-                <w:sz w:val="14"/>
-                <w:szCs w:val="14"/>
+                <w:sz w:val="12"/>
+                <w:szCs w:val="12"/>
               </w:rPr>
               <w:t xml:space="preserve">/ POOR</w:t>
             </w:r>
@@ -2696,23 +2696,23 @@
           <w:p>
             <w:r>
               <w:rPr>
-                <w:sz w:val="14"/>
-                <w:szCs w:val="14"/>
+                <w:sz w:val="12"/>
+                <w:szCs w:val="12"/>
               </w:rPr>
               <w:t xml:space="preserve">GOOD/ </w:t>
             </w:r>
             <w:r>
               <w:rPr>
-                <w:sz w:val="14"/>
-                <w:szCs w:val="14"/>
                 <w:strike/>
+                <w:sz w:val="12"/>
+                <w:szCs w:val="12"/>
               </w:rPr>
               <w:t xml:space="preserve">SAT</w:t>
             </w:r>
             <w:r>
               <w:rPr>
-                <w:sz w:val="14"/>
-                <w:szCs w:val="14"/>
+                <w:sz w:val="12"/>
+                <w:szCs w:val="12"/>
               </w:rPr>
               <w:t xml:space="preserve">/ POOR</w:t>
             </w:r>
@@ -2882,23 +2882,23 @@
           <w:p>
             <w:r>
               <w:rPr>
-                <w:sz w:val="14"/>
-                <w:szCs w:val="14"/>
+                <w:sz w:val="12"/>
+                <w:szCs w:val="12"/>
               </w:rPr>
               <w:t xml:space="preserve">GOOD/ </w:t>
             </w:r>
             <w:r>
               <w:rPr>
-                <w:sz w:val="14"/>
-                <w:szCs w:val="14"/>
                 <w:strike/>
+                <w:sz w:val="12"/>
+                <w:szCs w:val="12"/>
               </w:rPr>
               <w:t xml:space="preserve">SAT</w:t>
             </w:r>
             <w:r>
               <w:rPr>
-                <w:sz w:val="14"/>
-                <w:szCs w:val="14"/>
+                <w:sz w:val="12"/>
+                <w:szCs w:val="12"/>
               </w:rPr>
               <w:t xml:space="preserve">/ POOR</w:t>
             </w:r>

</xml_diff>